<commit_message>
Tema 1'e uzay dolgu modelleri: 1.3 EK bag kirilmasi/olusumu, 1.8 mekanizma basamaklari
</commit_message>
<xml_diff>
--- a/Kim11-1-3-EK-Entalpi.docx
+++ b/Kim11-1-3-EK-Entalpi.docx
@@ -752,6 +752,179 @@
     </w:p>
     <w:p>
       <w:pPr>
+        <w:jc w:val="both"/>
+        <w:rPr>
+          <w:rFonts w:ascii="Times New Roman" w:hAnsi="Times New Roman" w:cs="Times New Roman"/>
+          <w:lang w:val="tr-TR"/>
+        </w:rPr>
+      </w:pPr>
+      <w:r>
+        <w:rPr>
+          <w:rFonts w:ascii="Times New Roman" w:hAnsi="Times New Roman" w:cs="Times New Roman"/>
+          <w:lang w:val="tr-TR"/>
+        </w:rPr>
+        <w:t xml:space="preserve">Tepkime entalpisinin kaynağı, bağların kırılması ve oluşmasıdır. Bir bağı kırmak için enerji harcanır, yeni bir bağ oluşurken ise enerji açığa çıkar. Örneğin H</w:t>
+      </w:r>
+      <w:r>
+        <w:rPr>
+          <w:rFonts w:ascii="Times New Roman" w:hAnsi="Times New Roman" w:cs="Times New Roman"/>
+          <w:vertAlign w:val="subscript"/>
+          <w:lang w:val="tr-TR"/>
+        </w:rPr>
+        <w:t xml:space="preserve">2</w:t>
+      </w:r>
+      <w:r>
+        <w:rPr>
+          <w:rFonts w:ascii="Times New Roman" w:hAnsi="Times New Roman" w:cs="Times New Roman"/>
+          <w:lang w:val="tr-TR"/>
+        </w:rPr>
+        <w:t xml:space="preserve"> ve Cl</w:t>
+      </w:r>
+      <w:r>
+        <w:rPr>
+          <w:rFonts w:ascii="Times New Roman" w:hAnsi="Times New Roman" w:cs="Times New Roman"/>
+          <w:vertAlign w:val="subscript"/>
+          <w:lang w:val="tr-TR"/>
+        </w:rPr>
+        <w:t xml:space="preserve">2</w:t>
+      </w:r>
+      <w:r>
+        <w:rPr>
+          <w:rFonts w:ascii="Times New Roman" w:hAnsi="Times New Roman" w:cs="Times New Roman"/>
+          <w:lang w:val="tr-TR"/>
+        </w:rPr>
+        <w:t xml:space="preserve"> moleküllerinden HCl oluşurken önce H−H ve Cl−Cl bağları kırılır; bunun için 436 + 243 = 679 kJ enerji alınır. Ardından iki H−Cl bağı oluşur ve 2 · 431 = 862 kJ enerji açığa çıkar (Görsel A). Açığa çıkan enerji alınandan 183 kJ fazla olduğu için tepkime ekzotermiktir (ΔH = −183 kJ).</w:t>
+      </w:r>
+    </w:p>
+    <w:p xmlns:a="http://schemas.openxmlformats.org/drawingml/2006/main" xmlns:pic="http://schemas.openxmlformats.org/drawingml/2006/picture">
+      <w:pPr>
+        <w:jc w:val="center"/>
+        <w:rPr>
+          <w:rFonts w:ascii="Times New Roman" w:hAnsi="Times New Roman" w:cs="Times New Roman"/>
+          <w:lang w:val="tr-TR"/>
+        </w:rPr>
+      </w:pPr>
+      <w:r>
+        <w:drawing>
+          <wp:inline distT="0" distB="0" distL="0" distR="0">
+            <wp:extent cx="5400000" cy="2004303"/>
+            <wp:docPr id="900001" name="Grafik 900001" descr="H2 + Cl2 tepkimesinde bağların kırılması ve oluşması"/>
+            <wp:cNvGraphicFramePr>
+              <a:graphicFrameLocks noChangeAspect="1"/>
+            </wp:cNvGraphicFramePr>
+            <a:graphic>
+              <a:graphicData uri="http://schemas.openxmlformats.org/drawingml/2006/picture">
+                <pic:pic>
+                  <pic:nvPicPr>
+                    <pic:cNvPr id="900001" name="k11_900001.png"/>
+                    <pic:cNvPicPr/>
+                  </pic:nvPicPr>
+                  <pic:blipFill>
+                    <a:blip r:embed="rIdK1"/>
+                    <a:stretch>
+                      <a:fillRect/>
+                    </a:stretch>
+                  </pic:blipFill>
+                  <pic:spPr>
+                    <a:xfrm>
+                      <a:off x="0" y="0"/>
+                      <a:ext cx="5400000" cy="2004303"/>
+                    </a:xfrm>
+                    <a:prstGeom prst="rect">
+                      <a:avLst/>
+                    </a:prstGeom>
+                  </pic:spPr>
+                </pic:pic>
+              </a:graphicData>
+            </a:graphic>
+          </wp:inline>
+        </w:drawing>
+      </w:r>
+    </w:p>
+    <w:p>
+      <w:pPr>
+        <w:jc w:val="center"/>
+        <w:rPr>
+          <w:rFonts w:ascii="Times New Roman" w:hAnsi="Times New Roman" w:cs="Times New Roman"/>
+          <w:lang w:val="tr-TR"/>
+        </w:rPr>
+      </w:pPr>
+      <w:r>
+        <w:rPr>
+          <w:rFonts w:ascii="Times New Roman" w:hAnsi="Times New Roman" w:cs="Times New Roman"/>
+          <w:b/>
+          <w:bCs/>
+          <w:lang w:val="tr-TR"/>
+        </w:rPr>
+        <w:t xml:space="preserve">Görsel A:</w:t>
+      </w:r>
+      <w:r>
+        <w:rPr>
+          <w:rFonts w:ascii="Times New Roman" w:hAnsi="Times New Roman" w:cs="Times New Roman"/>
+          <w:lang w:val="tr-TR"/>
+        </w:rPr>
+        <w:t xml:space="preserve"> H</w:t>
+      </w:r>
+      <w:r>
+        <w:rPr>
+          <w:rFonts w:ascii="Times New Roman" w:hAnsi="Times New Roman" w:cs="Times New Roman"/>
+          <w:vertAlign w:val="subscript"/>
+          <w:lang w:val="tr-TR"/>
+        </w:rPr>
+        <w:t xml:space="preserve">2</w:t>
+      </w:r>
+      <w:r>
+        <w:rPr>
+          <w:rFonts w:ascii="Times New Roman" w:hAnsi="Times New Roman" w:cs="Times New Roman"/>
+          <w:lang w:val="tr-TR"/>
+        </w:rPr>
+        <w:t xml:space="preserve">(g) + Cl</w:t>
+      </w:r>
+      <w:r>
+        <w:rPr>
+          <w:rFonts w:ascii="Times New Roman" w:hAnsi="Times New Roman" w:cs="Times New Roman"/>
+          <w:vertAlign w:val="subscript"/>
+          <w:lang w:val="tr-TR"/>
+        </w:rPr>
+        <w:t xml:space="preserve">2</w:t>
+      </w:r>
+      <w:r>
+        <w:rPr>
+          <w:rFonts w:ascii="Times New Roman" w:hAnsi="Times New Roman" w:cs="Times New Roman"/>
+          <w:lang w:val="tr-TR"/>
+        </w:rPr>
+        <w:t xml:space="preserve">(g) → 2HCl(g) tepkimesinde bağların kırılması ve oluşmasının uzay dolgu modeliyle gösterimi (H: beyaz, Cl: yeşil)</w:t>
+      </w:r>
+    </w:p>
+    <w:p>
+      <w:pPr>
+        <w:jc w:val="both"/>
+        <w:rPr>
+          <w:rFonts w:ascii="Times New Roman" w:hAnsi="Times New Roman" w:cs="Times New Roman"/>
+          <w:lang w:val="tr-TR"/>
+        </w:rPr>
+      </w:pPr>
+      <w:r>
+        <w:rPr>
+          <w:rFonts w:ascii="Times New Roman" w:hAnsi="Times New Roman" w:cs="Times New Roman"/>
+          <w:b/>
+          <w:bCs/>
+          <w:highlight w:val="yellow"/>
+          <w:lang w:val="tr-TR"/>
+        </w:rPr>
+        <w:t xml:space="preserve">NOT: </w:t>
+      </w:r>
+      <w:r>
+        <w:rPr>
+          <w:rFonts w:ascii="Times New Roman" w:hAnsi="Times New Roman" w:cs="Times New Roman"/>
+          <w:highlight w:val="yellow"/>
+          <w:lang w:val="tr-TR"/>
+        </w:rPr>
+        <w:t xml:space="preserve">Görsel harfi, Kim11-1-3 dosyasındaki görsel sırasına göre güncellenecektir. Bağ enerjileri Kim11-1-3’teki Tablo 1 ile aynıdır.</w:t>
+      </w:r>
+    </w:p>
+    <w:p>
+      <w:pPr>
         <w:keepNext/>
         <w:shd w:val="clear" w:color="auto" w:fill="E97132"/>
         <w:jc w:val="both"/>
@@ -849,7 +1022,7 @@
                 <wp:extent cx="5538486" cy="0"/>
                 <wp:effectExtent l="0" t="12700" r="24130" b="12700"/>
                 <wp:wrapNone/>
-                <wp:docPr id="900001" name="Straight Connector 1"/>
+                <wp:docPr id="900002" name="Straight Connector 1"/>
                 <wp:cNvGraphicFramePr/>
                 <a:graphic xmlns:a="http://schemas.openxmlformats.org/drawingml/2006/main">
                   <a:graphicData uri="http://schemas.microsoft.com/office/word/2010/wordprocessingShape">

</xml_diff>

<commit_message>
Konu anlatimlari Maarif modeline uyarlandi: bilgi metinleri baglam sorulariyla aciliyor ve etkinlik bulgularina baglaniyor
</commit_message>
<xml_diff>
--- a/Kim11-1-3-EK-Entalpi.docx
+++ b/Kim11-1-3-EK-Entalpi.docx
@@ -52,23 +52,7 @@
           <w:rFonts w:ascii="Times New Roman" w:hAnsi="Times New Roman" w:cs="Times New Roman"/>
           <w:lang w:val="tr-TR"/>
         </w:rPr>
-        <w:t xml:space="preserve">Bir maddenin tanecikleri sürekli hareket hâlindedir ve bu hareketten kaynaklanan bir kinetik enerjiye sahiptir. Ayrıca tanecikleri oluşturan atomlar arasındaki kimyasal bağlar ve tanecikler arasındaki etkileşimler nedeniyle maddenin bir potansiyel enerjisi de vardır. Bir sistemin iç enerjisiyle basınç-hacim etkisini birlikte hesaba katan ve sabit basınçtaki ısı alışverişini izlemeye yarayan büyüklüğe </w:t>
-      </w:r>
-      <w:r>
-        <w:rPr>
-          <w:rFonts w:ascii="Times New Roman" w:hAnsi="Times New Roman" w:cs="Times New Roman"/>
-          <w:b/>
-          <w:bCs/>
-          <w:lang w:val="tr-TR"/>
-        </w:rPr>
-        <w:t xml:space="preserve">entalpi</w:t>
-      </w:r>
-      <w:r>
-        <w:rPr>
-          <w:rFonts w:ascii="Times New Roman" w:hAnsi="Times New Roman" w:cs="Times New Roman"/>
-          <w:lang w:val="tr-TR"/>
-        </w:rPr>
-        <w:t xml:space="preserve"> adı verilir; H harfiyle gösterilir. Bir maddenin entalpisinin mutlak değeri ölçülemez; ancak bir değişim sırasında entalpideki değişim (ΔH) ölçülebilir ya da hesaplanabilir.</w:t>
+        <w:t xml:space="preserve">Analiz ve Keşif Atölyesi 1.3.’te bazı tepkimelerin entalpi değişiminin pozitif, bazılarının ise negatif olduğunu gördünüz ve tepkimeleri bu değere göre sınıflandırdınız. Peki “entalpi” olarak adlandırılan bu büyüklük neyi ifade eder? Bu soruyu yanıtlamak için önce maddenin sahip olduğu enerjiye bakmak gerekir. Bir maddenin tanecikleri sürekli hareket hâlindedir ve bu hareketten kaynaklanan bir kinetik enerjiye sahiptir. Ayrıca tanecikleri oluşturan atomlar arasındaki kimyasal bağlar ve tanecikler arasındaki etkileşimler nedeniyle maddenin bir potansiyel enerjisi de vardır. Bir sistemin iç enerjisiyle basınç-hacim etkisini birlikte hesaba katan ve sabit basınçtaki ısı alışverişini izlemeye yarayan büyüklüğe entalpi adı verilir; H harfiyle gösterilir. Bir maddenin entalpisinin mutlak değeri ölçülemez; ancak bir değişim sırasında entalpideki değişim (ΔH) ölçülebilir ya da hesaplanabilir.</w:t>
       </w:r>
     </w:p>
     <w:p>
@@ -609,23 +593,7 @@
           <w:rFonts w:ascii="Times New Roman" w:hAnsi="Times New Roman" w:cs="Times New Roman"/>
           <w:lang w:val="tr-TR"/>
         </w:rPr>
-        <w:t xml:space="preserve">Tepkime denklemiyle birlikte entalpi değişiminin de verildiği denklemlere </w:t>
-      </w:r>
-      <w:r>
-        <w:rPr>
-          <w:rFonts w:ascii="Times New Roman" w:hAnsi="Times New Roman" w:cs="Times New Roman"/>
-          <w:b/>
-          <w:bCs/>
-          <w:lang w:val="tr-TR"/>
-        </w:rPr>
-        <w:t xml:space="preserve">termokimyasal denklem</w:t>
-      </w:r>
-      <w:r>
-        <w:rPr>
-          <w:rFonts w:ascii="Times New Roman" w:hAnsi="Times New Roman" w:cs="Times New Roman"/>
-          <w:lang w:val="tr-TR"/>
-        </w:rPr>
-        <w:t xml:space="preserve"> denir. Termokimyasal denklemlerde maddelerin fiziksel hâlleri mutlaka belirtilir. Örneğin amonyak sentezi iki şekilde gösterilebilir:</w:t>
+        <w:t xml:space="preserve">Atölyedeki tabloda tepkime denklemlerinin yanında her tepkimeye ait entalpi değerinin de verildiğini fark ettiniz. Bu şekilde, tepkime denklemiyle birlikte entalpi değişiminin de verildiği denklemlere termokimyasal denklem denir. Termokimyasal denklemlerde maddelerin fiziksel hâlleri mutlaka belirtilir. Örneğin amonyak sentezi iki şekilde gösterilebilir:</w:t>
       </w:r>
     </w:p>
     <w:p>
@@ -763,13 +731,13 @@
           <w:rFonts w:ascii="Times New Roman" w:hAnsi="Times New Roman" w:cs="Times New Roman"/>
           <w:lang w:val="tr-TR"/>
         </w:rPr>
-        <w:t xml:space="preserve">Tepkime entalpisinin kaynağı, bağların kırılması ve oluşmasıdır. Bir bağı kırmak için enerji harcanır, yeni bir bağ oluşurken ise enerji açığa çıkar. Örneğin H</w:t>
+        <w:t xml:space="preserve">Atölyede tepkime entalpisi ile kırılan ve oluşan bağların enerjileri arasında kurduğunuz örüntü, tepkime entalpisinin kaynağının bağların kırılması ve oluşması olduğunu gösterir. Bir bağı kırmak için enerji harcanır, yeni bir bağ oluşurken ise enerji açığa çıkar. Örneğin H</w:t>
       </w:r>
       <w:r>
         <w:rPr>
           <w:rFonts w:ascii="Times New Roman" w:hAnsi="Times New Roman" w:cs="Times New Roman"/>
+          <w:lang w:val="tr-TR"/>
           <w:vertAlign w:val="subscript"/>
-          <w:lang w:val="tr-TR"/>
         </w:rPr>
         <w:t xml:space="preserve">2</w:t>
       </w:r>
@@ -783,8 +751,8 @@
       <w:r>
         <w:rPr>
           <w:rFonts w:ascii="Times New Roman" w:hAnsi="Times New Roman" w:cs="Times New Roman"/>
+          <w:lang w:val="tr-TR"/>
           <w:vertAlign w:val="subscript"/>
-          <w:lang w:val="tr-TR"/>
         </w:rPr>
         <w:t xml:space="preserve">2</w:t>
       </w:r>

</xml_diff>